<commit_message>
feat: publish learner-friendly Hermes video courseware v4.0
</commit_message>
<xml_diff>
--- a/courseware/LP-Agentic AI for Video Creation.docx
+++ b/courseware/LP-Agentic AI for Video Creation.docx
@@ -207,7 +207,7 @@
                 <w:b/>
                 <w:sz w:val="18"/>
               </w:rPr>
-              <w:t>v3.0</w:t>
+              <w:t>v4.0</w:t>
             </w:r>
           </w:p>
         </w:tc>
@@ -251,7 +251,7 @@
                 <w:b w:val="0"/>
                 <w:sz w:val="18"/>
               </w:rPr>
-              <w:t>15 September 2026</w:t>
+              <w:t>16 September 2026</w:t>
             </w:r>
           </w:p>
         </w:tc>
@@ -696,7 +696,109 @@
                 <w:b w:val="0"/>
                 <w:sz w:val="18"/>
               </w:rPr>
-              <w:t>Replaced n8n with Hermes Agent, MiniMax M3, FRAME-CUT prompting, video skills, Kanban multi-agent orchestration and scheduled private YouTube publishing</w:t>
+              <w:t>Replaced n8n with Hermes Agent, MiniMax M3, video skills, Kanban orchestration and scheduled private YouTube publishing</w:t>
+            </w:r>
+          </w:p>
+        </w:tc>
+      </w:tr>
+      <w:tr>
+        <w:tc>
+          <w:tcPr>
+            <w:tcW w:type="dxa" w:w="2028"/>
+            <w:vAlign w:val="center"/>
+          </w:tcPr>
+          <w:p>
+            <w:pPr>
+              <w:spacing w:after="40"/>
+            </w:pPr>
+            <w:r/>
+            <w:r>
+              <w:rPr>
+                <w:rFonts w:ascii="Arial" w:hAnsi="Arial"/>
+                <w:b w:val="0"/>
+                <w:sz w:val="18"/>
+              </w:rPr>
+              <w:t>Lesson Plan</w:t>
+            </w:r>
+          </w:p>
+        </w:tc>
+        <w:tc>
+          <w:tcPr>
+            <w:tcW w:type="dxa" w:w="2028"/>
+            <w:vAlign w:val="center"/>
+          </w:tcPr>
+          <w:p>
+            <w:pPr>
+              <w:spacing w:after="40"/>
+            </w:pPr>
+            <w:r/>
+            <w:r>
+              <w:rPr>
+                <w:rFonts w:ascii="Arial" w:hAnsi="Arial"/>
+                <w:b/>
+                <w:sz w:val="18"/>
+              </w:rPr>
+              <w:t>4.0</w:t>
+            </w:r>
+          </w:p>
+        </w:tc>
+        <w:tc>
+          <w:tcPr>
+            <w:tcW w:type="dxa" w:w="2028"/>
+            <w:vAlign w:val="center"/>
+          </w:tcPr>
+          <w:p>
+            <w:pPr>
+              <w:spacing w:after="40"/>
+            </w:pPr>
+            <w:r/>
+            <w:r>
+              <w:rPr>
+                <w:rFonts w:ascii="Arial" w:hAnsi="Arial"/>
+                <w:b w:val="0"/>
+                <w:sz w:val="18"/>
+              </w:rPr>
+              <w:t>16 September 2026</w:t>
+            </w:r>
+          </w:p>
+        </w:tc>
+        <w:tc>
+          <w:tcPr>
+            <w:tcW w:type="dxa" w:w="2028"/>
+            <w:vAlign w:val="center"/>
+          </w:tcPr>
+          <w:p>
+            <w:pPr>
+              <w:spacing w:after="40"/>
+            </w:pPr>
+            <w:r/>
+            <w:r>
+              <w:rPr>
+                <w:rFonts w:ascii="Arial" w:hAnsi="Arial"/>
+                <w:b w:val="0"/>
+                <w:sz w:val="18"/>
+              </w:rPr>
+              <w:t>Tertiary Infotech Academy Pte Ltd</w:t>
+            </w:r>
+          </w:p>
+        </w:tc>
+        <w:tc>
+          <w:tcPr>
+            <w:tcW w:type="dxa" w:w="2028"/>
+            <w:vAlign w:val="center"/>
+          </w:tcPr>
+          <w:p>
+            <w:pPr>
+              <w:spacing w:after="40"/>
+            </w:pPr>
+            <w:r/>
+            <w:r>
+              <w:rPr>
+                <w:rFonts w:ascii="Arial" w:hAnsi="Arial"/>
+                <w:b w:val="0"/>
+                <w:sz w:val="18"/>
+              </w:rPr>
+              <w:t>Simplified the course around practical video creation, four connected labs, prompt examples and a consistent one-minute micro-drama series</w:t>
             </w:r>
           </w:p>
         </w:tc>
@@ -1438,7 +1540,7 @@
                 <w:b w:val="0"/>
                 <w:sz w:val="18"/>
               </w:rPr>
-              <w:t>Course deck, Learner Guide, eight lab folders, Hermes Desktop, MiniMax M3 access, Remotion/Manim/Higgsfield options and FFmpeg</w:t>
+              <w:t>Course deck, Learner Guide, four lab folders, Hermes Desktop, MiniMax M3 access, optional video tools and authorised creative assets</w:t>
             </w:r>
           </w:p>
         </w:tc>
@@ -1457,7 +1559,7 @@
         <w:pStyle w:val="ListBullet"/>
       </w:pPr>
       <w:r>
-        <w:t>LO1: Develop an editing strategy and work plan in Hermes Agent using MiniMax M3, structured video prompts and governed tool selection.</w:t>
+        <w:t>LO1: Explain the agentic loop, set up Hermes Agent with MiniMax M3, and create a first short video from a clear prompt.</w:t>
       </w:r>
     </w:p>
     <w:p>
@@ -1465,7 +1567,7 @@
         <w:pStyle w:val="ListBullet"/>
       </w:pPr>
       <w:r>
-        <w:t>LO2: Create and customise an evidence-backed video with Hermes skills, Remotion, Manim, Higgsfield-compatible requests and deterministic media checks.</w:t>
+        <w:t>LO2: Improve the first video by choosing suitable video tools, adding reusable skills, and applying brand, tone and style guidance.</w:t>
       </w:r>
     </w:p>
     <w:p>
@@ -1473,7 +1575,15 @@
         <w:pStyle w:val="ListBullet"/>
       </w:pPr>
       <w:r>
-        <w:t>LO3: Orchestrate research, production, review and YouTube release agents through a durable Kanban board and controlled scheduled publishing.</w:t>
+        <w:t>LO3: Coordinate research, script, video, review and YouTube agents on a Kanban board and schedule the workflow.</w:t>
+      </w:r>
+    </w:p>
+    <w:p>
+      <w:pPr>
+        <w:pStyle w:val="ListBullet"/>
+      </w:pPr>
+      <w:r>
+        <w:t>LO4: Plan a consistent one-minute micro-drama series with reusable story, character, location and visual references.</w:t>
       </w:r>
     </w:p>
     <w:p>
@@ -1489,7 +1599,7 @@
         <w:pStyle w:val="ListBullet"/>
       </w:pPr>
       <w:r>
-        <w:t>Use the PPT for mechanism visualisation, technical dialogue and evidence interpretation; do not demonstrate click-by-click procedures from the slides.</w:t>
+        <w:t>Use the PPT for visual explanations, prompt examples, storytelling discussion and before-after critique.</w:t>
       </w:r>
     </w:p>
     <w:p>
@@ -1497,7 +1607,7 @@
         <w:pStyle w:val="ListBullet"/>
       </w:pPr>
       <w:r>
-        <w:t>Use the Learner Guide and lab PDFs for detailed procedures, prompts, troubleshooting and acceptance checks.</w:t>
+        <w:t>Use the Learner Guide and lab PDFs for setup steps, detailed procedures and troubleshooting.</w:t>
       </w:r>
     </w:p>
     <w:p>
@@ -1505,7 +1615,7 @@
         <w:pStyle w:val="ListBullet"/>
       </w:pPr>
       <w:r>
-        <w:t>Keep all external publishing actions disabled or dry-run during learner practice.</w:t>
+        <w:t>Let learners create early, review often and change one creative choice at a time.</w:t>
       </w:r>
     </w:p>
     <w:p>
@@ -1513,7 +1623,7 @@
         <w:pStyle w:val="ListBullet"/>
       </w:pPr>
       <w:r>
-        <w:t>Require observable execution evidence before accepting an agent response or learner conclusion.</w:t>
+        <w:t>Keep external publishing Private and schedules Paused during learner practice.</w:t>
       </w:r>
     </w:p>
     <w:p>
@@ -1794,7 +1904,7 @@
                 <w:b w:val="0"/>
                 <w:sz w:val="16"/>
               </w:rPr>
-              <w:t>Hermes Desktop, MiniMax M3 and credential boundaries</w:t>
+              <w:t>AI agents, the agentic loop, Hermes Desktop and MiniMax M3</w:t>
             </w:r>
           </w:p>
         </w:tc>
@@ -1814,7 +1924,7 @@
                 <w:b w:val="0"/>
                 <w:sz w:val="16"/>
               </w:rPr>
-              <w:t>Mechanism dialogue + guided setup</w:t>
+              <w:t>Visual explanation + guided setup</w:t>
             </w:r>
           </w:p>
         </w:tc>
@@ -1834,7 +1944,7 @@
                 <w:b w:val="0"/>
                 <w:sz w:val="16"/>
               </w:rPr>
-              <w:t>Slides 15–38</w:t>
+              <w:t>Slides 15–26</w:t>
             </w:r>
           </w:p>
         </w:tc>
@@ -1854,7 +1964,7 @@
                 <w:b w:val="0"/>
                 <w:sz w:val="16"/>
               </w:rPr>
-              <w:t>Setup evidence; redacted model verification</w:t>
+              <w:t>Hermes project opened; model choice recorded</w:t>
             </w:r>
           </w:p>
         </w:tc>
@@ -1897,7 +2007,7 @@
                 <w:b w:val="0"/>
                 <w:sz w:val="16"/>
               </w:rPr>
-              <w:t>FRAME-CUT prompt, structured shot plan and stop rules</w:t>
+              <w:t>Video prompt engineering and first-shot planning</w:t>
             </w:r>
           </w:p>
         </w:tc>
@@ -1917,7 +2027,7 @@
                 <w:b w:val="0"/>
                 <w:sz w:val="16"/>
               </w:rPr>
-              <w:t>Technical explanation + critique</w:t>
+              <w:t>Prompt comparison + storyboard critique</w:t>
             </w:r>
           </w:p>
         </w:tc>
@@ -1937,7 +2047,7 @@
                 <w:b w:val="0"/>
                 <w:sz w:val="16"/>
               </w:rPr>
-              <w:t>Slides 39–64</w:t>
+              <w:t>Slides 27–41</w:t>
             </w:r>
           </w:p>
         </w:tc>
@@ -1957,7 +2067,7 @@
                 <w:b w:val="0"/>
                 <w:sz w:val="16"/>
               </w:rPr>
-              <w:t>Prompt contract and timed storyboard rationale</w:t>
+              <w:t>Simple prompt, stronger prompt and three-shot plan</w:t>
             </w:r>
           </w:p>
         </w:tc>
@@ -2083,7 +2193,7 @@
                 <w:color w:val="1875C4"/>
                 <w:sz w:val="16"/>
               </w:rPr>
-              <w:t>14:00–17:15</w:t>
+              <w:t>14:00–15:30</w:t>
             </w:r>
           </w:p>
         </w:tc>
@@ -2103,7 +2213,7 @@
                 <w:b w:val="0"/>
                 <w:sz w:val="16"/>
               </w:rPr>
-              <w:t>Labs 01–03: Hermes setup, simple video and FRAME-CUT</w:t>
+              <w:t>Lab 01: create the first video</w:t>
             </w:r>
           </w:p>
         </w:tc>
@@ -2123,7 +2233,7 @@
                 <w:b w:val="0"/>
                 <w:sz w:val="16"/>
               </w:rPr>
-              <w:t>Guided lab; individual execution evidence</w:t>
+              <w:t>Guided creation</w:t>
             </w:r>
           </w:p>
         </w:tc>
@@ -2143,7 +2253,7 @@
                 <w:b w:val="0"/>
                 <w:sz w:val="16"/>
               </w:rPr>
-              <w:t>Topic 1 lab slides + LG §5.1–5.3</w:t>
+              <w:t>Lab 01 guide and prompts</w:t>
             </w:r>
           </w:p>
         </w:tc>
@@ -2163,7 +2273,110 @@
                 <w:b w:val="0"/>
                 <w:sz w:val="16"/>
               </w:rPr>
-              <w:t>MiniMax-M3 check; MP4 preview; prompt Markdown/PDF; verifier evidence</w:t>
+              <w:t>First 15-second video and review notes</w:t>
+            </w:r>
+          </w:p>
+        </w:tc>
+      </w:tr>
+      <w:tr>
+        <w:tc>
+          <w:tcPr>
+            <w:tcW w:type="dxa" w:w="2028"/>
+            <w:vAlign w:val="center"/>
+          </w:tcPr>
+          <w:p>
+            <w:pPr>
+              <w:spacing w:after="40"/>
+            </w:pPr>
+            <w:r/>
+            <w:r>
+              <w:rPr>
+                <w:rFonts w:ascii="Arial" w:hAnsi="Arial"/>
+                <w:b/>
+                <w:color w:val="1875C4"/>
+                <w:sz w:val="16"/>
+              </w:rPr>
+              <w:t>15:30–17:15</w:t>
+            </w:r>
+          </w:p>
+        </w:tc>
+        <w:tc>
+          <w:tcPr>
+            <w:tcW w:type="dxa" w:w="2028"/>
+            <w:vAlign w:val="center"/>
+          </w:tcPr>
+          <w:p>
+            <w:pPr>
+              <w:spacing w:after="40"/>
+            </w:pPr>
+            <w:r/>
+            <w:r>
+              <w:rPr>
+                <w:rFonts w:ascii="Arial" w:hAnsi="Arial"/>
+                <w:b w:val="0"/>
+                <w:sz w:val="16"/>
+              </w:rPr>
+              <w:t>Topic 2: tools, skills and creative improvement</w:t>
+            </w:r>
+          </w:p>
+        </w:tc>
+        <w:tc>
+          <w:tcPr>
+            <w:tcW w:type="dxa" w:w="2028"/>
+            <w:vAlign w:val="center"/>
+          </w:tcPr>
+          <w:p>
+            <w:pPr>
+              <w:spacing w:after="40"/>
+            </w:pPr>
+            <w:r/>
+            <w:r>
+              <w:rPr>
+                <w:rFonts w:ascii="Arial" w:hAnsi="Arial"/>
+                <w:b w:val="0"/>
+                <w:sz w:val="16"/>
+              </w:rPr>
+              <w:t>Visual comparison + guided demonstration</w:t>
+            </w:r>
+          </w:p>
+        </w:tc>
+        <w:tc>
+          <w:tcPr>
+            <w:tcW w:type="dxa" w:w="2028"/>
+            <w:vAlign w:val="center"/>
+          </w:tcPr>
+          <w:p>
+            <w:pPr>
+              <w:spacing w:after="40"/>
+            </w:pPr>
+            <w:r/>
+            <w:r>
+              <w:rPr>
+                <w:rFonts w:ascii="Arial" w:hAnsi="Arial"/>
+                <w:b w:val="0"/>
+                <w:sz w:val="16"/>
+              </w:rPr>
+              <w:t>Slides 42–68</w:t>
+            </w:r>
+          </w:p>
+        </w:tc>
+        <w:tc>
+          <w:tcPr>
+            <w:tcW w:type="dxa" w:w="2028"/>
+            <w:vAlign w:val="center"/>
+          </w:tcPr>
+          <w:p>
+            <w:pPr>
+              <w:spacing w:after="40"/>
+            </w:pPr>
+            <w:r/>
+            <w:r>
+              <w:rPr>
+                <w:rFonts w:ascii="Arial" w:hAnsi="Arial"/>
+                <w:b w:val="0"/>
+                <w:sz w:val="16"/>
+              </w:rPr>
+              <w:t>Tool choice and reusable video-skill plan</w:t>
             </w:r>
           </w:p>
         </w:tc>
@@ -2206,7 +2419,7 @@
                 <w:b w:val="0"/>
                 <w:sz w:val="16"/>
               </w:rPr>
-              <w:t>Checkpoint and transfer challenge</w:t>
+              <w:t>Lab 02 briefing and creative checkpoint</w:t>
             </w:r>
           </w:p>
         </w:tc>
@@ -2246,7 +2459,7 @@
                 <w:b w:val="0"/>
                 <w:sz w:val="16"/>
               </w:rPr>
-              <w:t>Slides 74–75</w:t>
+              <w:t>Lab 02 guide and prompts</w:t>
             </w:r>
           </w:p>
         </w:tc>
@@ -2266,7 +2479,7 @@
                 <w:b w:val="0"/>
                 <w:sz w:val="16"/>
               </w:rPr>
-              <w:t>Explained failure class, threshold, evidence and owner</w:t>
+              <w:t>Specific plan to improve the first video</w:t>
             </w:r>
           </w:p>
         </w:tc>
@@ -2428,7 +2641,7 @@
                 <w:color w:val="1875C4"/>
                 <w:sz w:val="16"/>
               </w:rPr>
-              <w:t>09:00–10:45</w:t>
+              <w:t>09:00–10:00</w:t>
             </w:r>
           </w:p>
         </w:tc>
@@ -2448,7 +2661,7 @@
                 <w:b w:val="0"/>
                 <w:sz w:val="16"/>
               </w:rPr>
-              <w:t>Remotion, Manim, Higgsfield, FFmpeg and Hermes skill anatomy</w:t>
+              <w:t>Lab 02: improve the first video</w:t>
             </w:r>
           </w:p>
         </w:tc>
@@ -2468,7 +2681,7 @@
                 <w:b w:val="0"/>
                 <w:sz w:val="16"/>
               </w:rPr>
-              <w:t>Mechanism dialogue + technical demonstration</w:t>
+              <w:t>Guided creation + before-after review</w:t>
             </w:r>
           </w:p>
         </w:tc>
@@ -2488,7 +2701,7 @@
                 <w:b w:val="0"/>
                 <w:sz w:val="16"/>
               </w:rPr>
-              <w:t>Slides 76–105</w:t>
+              <w:t>Lab 02 guide and prompts</w:t>
             </w:r>
           </w:p>
         </w:tc>
@@ -2508,7 +2721,7 @@
                 <w:b w:val="0"/>
                 <w:sz w:val="16"/>
               </w:rPr>
-              <w:t>Tool registry; skill contracts; render evidence</w:t>
+              <w:t>Improved branded video and comparison</w:t>
             </w:r>
           </w:p>
         </w:tc>
@@ -2531,7 +2744,7 @@
                 <w:color w:val="1875C4"/>
                 <w:sz w:val="16"/>
               </w:rPr>
-              <w:t>10:45–12:30</w:t>
+              <w:t>10:00–11:45</w:t>
             </w:r>
           </w:p>
         </w:tc>
@@ -2551,7 +2764,7 @@
                 <w:b w:val="0"/>
                 <w:sz w:val="16"/>
               </w:rPr>
-              <w:t>Custom brand-video skill, technical QA and repair</w:t>
+              <w:t>Topic 3: five profiles, Kanban, YouTube and scheduling</w:t>
             </w:r>
           </w:p>
         </w:tc>
@@ -2571,7 +2784,7 @@
                 <w:b w:val="0"/>
                 <w:sz w:val="16"/>
               </w:rPr>
-              <w:t>Evidence review + skill construction</w:t>
+              <w:t>Role play + visual workflow demonstration</w:t>
             </w:r>
           </w:p>
         </w:tc>
@@ -2591,7 +2804,7 @@
                 <w:b w:val="0"/>
                 <w:sz w:val="16"/>
               </w:rPr>
-              <w:t>Slides 106–133</w:t>
+              <w:t>Slides 69–95</w:t>
             </w:r>
           </w:p>
         </w:tc>
@@ -2611,7 +2824,110 @@
                 <w:b w:val="0"/>
                 <w:sz w:val="16"/>
               </w:rPr>
-              <w:t>Branded MP4, probe, review and versioned repair</w:t>
+              <w:t>Five-agent board and publishing plan</w:t>
+            </w:r>
+          </w:p>
+        </w:tc>
+      </w:tr>
+      <w:tr>
+        <w:tc>
+          <w:tcPr>
+            <w:tcW w:type="dxa" w:w="2028"/>
+            <w:vAlign w:val="center"/>
+          </w:tcPr>
+          <w:p>
+            <w:pPr>
+              <w:spacing w:after="40"/>
+            </w:pPr>
+            <w:r/>
+            <w:r>
+              <w:rPr>
+                <w:rFonts w:ascii="Arial" w:hAnsi="Arial"/>
+                <w:b/>
+                <w:color w:val="1875C4"/>
+                <w:sz w:val="16"/>
+              </w:rPr>
+              <w:t>11:45–12:30</w:t>
+            </w:r>
+          </w:p>
+        </w:tc>
+        <w:tc>
+          <w:tcPr>
+            <w:tcW w:type="dxa" w:w="2028"/>
+            <w:vAlign w:val="center"/>
+          </w:tcPr>
+          <w:p>
+            <w:pPr>
+              <w:spacing w:after="40"/>
+            </w:pPr>
+            <w:r/>
+            <w:r>
+              <w:rPr>
+                <w:rFonts w:ascii="Arial" w:hAnsi="Arial"/>
+                <w:b w:val="0"/>
+                <w:sz w:val="16"/>
+              </w:rPr>
+              <w:t>Lab 03: improve with the multi-agent team</w:t>
+            </w:r>
+          </w:p>
+        </w:tc>
+        <w:tc>
+          <w:tcPr>
+            <w:tcW w:type="dxa" w:w="2028"/>
+            <w:vAlign w:val="center"/>
+          </w:tcPr>
+          <w:p>
+            <w:pPr>
+              <w:spacing w:after="40"/>
+            </w:pPr>
+            <w:r/>
+            <w:r>
+              <w:rPr>
+                <w:rFonts w:ascii="Arial" w:hAnsi="Arial"/>
+                <w:b w:val="0"/>
+                <w:sz w:val="16"/>
+              </w:rPr>
+              <w:t>Guided orchestration</w:t>
+            </w:r>
+          </w:p>
+        </w:tc>
+        <w:tc>
+          <w:tcPr>
+            <w:tcW w:type="dxa" w:w="2028"/>
+            <w:vAlign w:val="center"/>
+          </w:tcPr>
+          <w:p>
+            <w:pPr>
+              <w:spacing w:after="40"/>
+            </w:pPr>
+            <w:r/>
+            <w:r>
+              <w:rPr>
+                <w:rFonts w:ascii="Arial" w:hAnsi="Arial"/>
+                <w:b w:val="0"/>
+                <w:sz w:val="16"/>
+              </w:rPr>
+              <w:t>Lab 03 guide and prompts</w:t>
+            </w:r>
+          </w:p>
+        </w:tc>
+        <w:tc>
+          <w:tcPr>
+            <w:tcW w:type="dxa" w:w="2028"/>
+            <w:vAlign w:val="center"/>
+          </w:tcPr>
+          <w:p>
+            <w:pPr>
+              <w:spacing w:after="40"/>
+            </w:pPr>
+            <w:r/>
+            <w:r>
+              <w:rPr>
+                <w:rFonts w:ascii="Arial" w:hAnsi="Arial"/>
+                <w:b w:val="0"/>
+                <w:sz w:val="16"/>
+              </w:rPr>
+              <w:t>Team-produced video, audit and Private upload preview</w:t>
             </w:r>
           </w:p>
         </w:tc>
@@ -2737,7 +3053,7 @@
                 <w:color w:val="1875C4"/>
                 <w:sz w:val="16"/>
               </w:rPr>
-              <w:t>13:30–15:15</w:t>
+              <w:t>13:30–14:30</w:t>
             </w:r>
           </w:p>
         </w:tc>
@@ -2757,7 +3073,7 @@
                 <w:b w:val="0"/>
                 <w:sz w:val="16"/>
               </w:rPr>
-              <w:t>Labs 04–06: tools, custom skill and multi-agent workflow</w:t>
+              <w:t>Topic 4: consistent storyboards, characters and micro-drama series</w:t>
             </w:r>
           </w:p>
         </w:tc>
@@ -2777,7 +3093,7 @@
                 <w:b w:val="0"/>
                 <w:sz w:val="16"/>
               </w:rPr>
-              <w:t>Guided lab; verifier-led evidence</w:t>
+              <w:t>Visual story workshop</w:t>
             </w:r>
           </w:p>
         </w:tc>
@@ -2797,7 +3113,7 @@
                 <w:b w:val="0"/>
                 <w:sz w:val="16"/>
               </w:rPr>
-              <w:t>Topic 2/3 lab slides + LG §5.4–5.6</w:t>
+              <w:t>Slides 96–122</w:t>
             </w:r>
           </w:p>
         </w:tc>
@@ -2817,7 +3133,7 @@
                 <w:b w:val="0"/>
                 <w:sz w:val="16"/>
               </w:rPr>
-              <w:t>Tool registry, branded video and role handoffs</w:t>
+              <w:t>Series promise, character bible and six-shot storyboard</w:t>
             </w:r>
           </w:p>
         </w:tc>
@@ -2840,7 +3156,7 @@
                 <w:color w:val="1875C4"/>
                 <w:sz w:val="16"/>
               </w:rPr>
-              <w:t>15:15–16:00</w:t>
+              <w:t>14:30–16:00</w:t>
             </w:r>
           </w:p>
         </w:tc>
@@ -2860,7 +3176,7 @@
                 <w:b w:val="0"/>
                 <w:sz w:val="16"/>
               </w:rPr>
-              <w:t>Labs 07–08: Kanban, private YouTube upload and cron</w:t>
+              <w:t>Lab 04: create a one-minute micro-drama pilot</w:t>
             </w:r>
           </w:p>
         </w:tc>
@@ -2880,7 +3196,7 @@
                 <w:b w:val="0"/>
                 <w:sz w:val="16"/>
               </w:rPr>
-              <w:t>Dry-run orchestration + decision review</w:t>
+              <w:t>Guided team production + continuity review</w:t>
             </w:r>
           </w:p>
         </w:tc>
@@ -2900,7 +3216,7 @@
                 <w:b w:val="0"/>
                 <w:sz w:val="16"/>
               </w:rPr>
-              <w:t>Slides 134–184; LG §5.7–5.8</w:t>
+              <w:t>Lab 04 guide and prompts</w:t>
             </w:r>
           </w:p>
         </w:tc>
@@ -2920,7 +3236,7 @@
                 <w:b w:val="0"/>
                 <w:sz w:val="16"/>
               </w:rPr>
-              <w:t>Kanban graph, upload preview and paused cron evidence</w:t>
+              <w:t>Pilot episode, storyboard and continuity review</w:t>
             </w:r>
           </w:p>
         </w:tc>
@@ -3484,7 +3800,7 @@
         <w:pStyle w:val="ListBullet"/>
       </w:pPr>
       <w:r>
-        <w:t>Confirm the course identity, version and 200-slide deck before class.</w:t>
+        <w:t>Confirm the course identity, version and 129-slide deck before class.</w:t>
       </w:r>
     </w:p>
     <w:p>
@@ -3492,7 +3808,7 @@
         <w:pStyle w:val="ListBullet"/>
       </w:pPr>
       <w:r>
-        <w:t>Verify that every lab folder contains README, AI-PROMPTS Markdown/PDF, synthetic data, starter files, evidence checklist and verify.py.</w:t>
+        <w:t>Verify that all four lab folders contain README, AI-PROMPTS Markdown/PDF, examples, starter files and review checklist.</w:t>
       </w:r>
     </w:p>
     <w:p>
@@ -3500,7 +3816,15 @@
         <w:pStyle w:val="ListBullet"/>
       </w:pPr>
       <w:r>
-        <w:t>Confirm Hermes Desktop and MiniMax-M3 access; keep YouTube private and cron paused until the named approval gate.</w:t>
+        <w:t>Confirm Hermes Desktop and MiniMax M3 access; ask learners to verify the current plan and trial shown in their own account.</w:t>
+      </w:r>
+    </w:p>
+    <w:p>
+      <w:pPr>
+        <w:pStyle w:val="ListBullet"/>
+      </w:pPr>
+      <w:r>
+        <w:t>Keep YouTube Private and the schedule Paused until trainer-supervised approval.</w:t>
       </w:r>
     </w:p>
     <w:p>
@@ -3538,7 +3862,7 @@
         <w:t xml:space="preserve">Official course page: </w:t>
       </w:r>
       <w:r>
-        <w:t>https://www.tertiarycourses.com.sg/wsq-agentic-ai-for-video-creation.html — Course identity, duration, outcomes and TSC</w:t>
+        <w:t>https://www.tertiarycourses.com.sg/wsq-agentic-ai-for-video-creation.html — Course identity, duration and learning outcomes</w:t>
       </w:r>
     </w:p>
     <w:p>
@@ -3552,7 +3876,7 @@
         <w:t xml:space="preserve">Hermes Desktop: </w:t>
       </w:r>
       <w:r>
-        <w:t>https://hermes-agent.nousresearch.com/desktop — Official desktop installer and supported operating systems</w:t>
+        <w:t>https://hermes-agent.nousresearch.com/desktop — Official desktop download and product overview</w:t>
       </w:r>
     </w:p>
     <w:p>
@@ -3563,24 +3887,10 @@
         <w:rPr>
           <w:b/>
         </w:rPr>
-        <w:t xml:space="preserve">Hermes Agent installation: </w:t>
+        <w:t xml:space="preserve">Hermes Agent documentation: </w:t>
       </w:r>
       <w:r>
-        <w:t>https://hermes-agent.nousresearch.com/docs/getting-started/installation — Desktop and CLI installation plus diagnostic commands</w:t>
-      </w:r>
-    </w:p>
-    <w:p>
-      <w:pPr>
-        <w:pStyle w:val="ListBullet"/>
-      </w:pPr>
-      <w:r>
-        <w:rPr>
-          <w:b/>
-        </w:rPr>
-        <w:t xml:space="preserve">Hermes model configuration: </w:t>
-      </w:r>
-      <w:r>
-        <w:t>https://hermes-agent.nousresearch.com/docs/user-guide/configuring-models — Provider, model and auxiliary-task configuration</w:t>
+        <w:t>https://hermes-agent.nousresearch.com/docs — Current setup, skills, profiles, Kanban and scheduling guidance</w:t>
       </w:r>
     </w:p>
     <w:p>
@@ -3594,7 +3904,7 @@
         <w:t xml:space="preserve">MiniMax M3: </w:t>
       </w:r>
       <w:r>
-        <w:t>https://www.minimax.io/models/text/m3 — Current MiniMax-M3 model identifier and agentic capabilities</w:t>
+        <w:t>https://www.minimax.io/models/text/m3 — Current M3 model and subscription information</w:t>
       </w:r>
     </w:p>
     <w:p>
@@ -3605,10 +3915,10 @@
         <w:rPr>
           <w:b/>
         </w:rPr>
-        <w:t xml:space="preserve">Hermes skills: </w:t>
+        <w:t xml:space="preserve">Remotion: </w:t>
       </w:r>
       <w:r>
-        <w:t>https://hermes-agent.nousresearch.com/docs/guides/work-with-skills — Skill discovery, invocation and custom SKILL.md structure</w:t>
+        <w:t>https://www.remotion.dev/ — Code-driven branded motion graphics</w:t>
       </w:r>
     </w:p>
     <w:p>
@@ -3619,66 +3929,10 @@
         <w:rPr>
           <w:b/>
         </w:rPr>
-        <w:t xml:space="preserve">Hermes delegation: </w:t>
+        <w:t xml:space="preserve">Manim: </w:t>
       </w:r>
       <w:r>
-        <w:t>https://hermes-agent.nousresearch.com/docs/guides/delegation-patterns — Isolated subagents, explicit context and parallel work</w:t>
-      </w:r>
-    </w:p>
-    <w:p>
-      <w:pPr>
-        <w:pStyle w:val="ListBullet"/>
-      </w:pPr>
-      <w:r>
-        <w:rPr>
-          <w:b/>
-        </w:rPr>
-        <w:t xml:space="preserve">Hermes Kanban: </w:t>
-      </w:r>
-      <w:r>
-        <w:t>https://hermes-agent.nousresearch.com/docs/user-guide/features/kanban — Durable multi-agent task dependencies and review states</w:t>
-      </w:r>
-    </w:p>
-    <w:p>
-      <w:pPr>
-        <w:pStyle w:val="ListBullet"/>
-      </w:pPr>
-      <w:r>
-        <w:rPr>
-          <w:b/>
-        </w:rPr>
-        <w:t xml:space="preserve">Hermes scheduled tasks: </w:t>
-      </w:r>
-      <w:r>
-        <w:t>https://hermes-agent.nousresearch.com/docs/user-guide/features/cron — Cron jobs, attached skills and fresh-session behavior</w:t>
-      </w:r>
-    </w:p>
-    <w:p>
-      <w:pPr>
-        <w:pStyle w:val="ListBullet"/>
-      </w:pPr>
-      <w:r>
-        <w:rPr>
-          <w:b/>
-        </w:rPr>
-        <w:t xml:space="preserve">Remotion documentation: </w:t>
-      </w:r>
-      <w:r>
-        <w:t>https://www.remotion.dev/docs — Code-driven video compositions and rendering</w:t>
-      </w:r>
-    </w:p>
-    <w:p>
-      <w:pPr>
-        <w:pStyle w:val="ListBullet"/>
-      </w:pPr>
-      <w:r>
-        <w:rPr>
-          <w:b/>
-        </w:rPr>
-        <w:t xml:space="preserve">Manim documentation: </w:t>
-      </w:r>
-      <w:r>
-        <w:t>https://docs.manim.community/ — Programmatic explanatory animation</w:t>
+        <w:t>https://www.manim.community/ — Explanatory animation</w:t>
       </w:r>
     </w:p>
     <w:p>
@@ -3692,7 +3946,7 @@
         <w:t xml:space="preserve">Higgsfield: </w:t>
       </w:r>
       <w:r>
-        <w:t>https://higgsfield.ai/ — Generative video shot production; verify current account and quota terms</w:t>
+        <w:t>https://higgsfield.ai/ — Generative video shots and creative effects</w:t>
       </w:r>
     </w:p>
     <w:p>
@@ -3703,10 +3957,10 @@
         <w:rPr>
           <w:b/>
         </w:rPr>
-        <w:t xml:space="preserve">YouTube videos.insert: </w:t>
+        <w:t xml:space="preserve">YouTube Help: </w:t>
       </w:r>
       <w:r>
-        <w:t>https://developers.google.com/youtube/v3/docs/videos/insert — OAuth upload, snippet and status fields</w:t>
+        <w:t>https://support.google.com/youtube/ — Upload, privacy and channel guidance</w:t>
       </w:r>
     </w:p>
     <w:p>
@@ -3720,7 +3974,7 @@
         <w:t xml:space="preserve">AI Video Prompting: </w:t>
       </w:r>
       <w:r>
-        <w:t>reference/AI Video Prompting.pdf — Shot grammar, camera movement and continuity patterns</w:t>
+        <w:t>reference/AI Video Prompting.pdf — Video prompt structure, shot descriptions and continuity</w:t>
       </w:r>
     </w:p>
     <w:p>
@@ -3734,7 +3988,7 @@
         <w:t xml:space="preserve">Hermes Agent The Complete Developers: </w:t>
       </w:r>
       <w:r>
-        <w:t>reference/Hermes Agent The Complete Developers.pdf — Supplied reference for agent architecture, tools, memory and orchestration</w:t>
+        <w:t>reference/Hermes Agent The Complete Developers.pdf — Supplied reference for agents, tools, skills and orchestration</w:t>
       </w:r>
     </w:p>
     <w:sectPr>
@@ -3761,7 +4015,7 @@
         <w:color w:val="526577"/>
         <w:sz w:val="16"/>
       </w:rPr>
-      <w:t>Agentic AI for Video Creation  •  TGS-2023036088  •  v3.0  |  © Tertiary Infotech Academy Pte Ltd</w:t>
+      <w:t>Agentic AI for Video Creation  •  TGS-2023036088  •  v4.0  |  © Tertiary Infotech Academy Pte Ltd</w:t>
     </w:r>
   </w:p>
 </w:ftr>

</xml_diff>